<commit_message>
putting into under construction
</commit_message>
<xml_diff>
--- a/bins/custom-reference.docx
+++ b/bins/custom-reference.docx
@@ -95,56 +95,75 @@
         <w:rPr>
           <w:rFonts w:ascii="Times New Roman" w:hAnsi="Times New Roman"/>
         </w:rPr>
+        <w:t>Abstract</w:t>
+      </w:r>
+    </w:p>
+    <w:p>
+      <w:pPr>
+        <w:pStyle w:val="Heading1"/>
+        <w:rPr/>
+      </w:pPr>
+      <w:bookmarkStart w:id="0" w:name="heading-1"/>
+      <w:r>
+        <w:rPr/>
         <w:t xml:space="preserve"> </w:t>
       </w:r>
       <w:r>
-        <w:rPr>
-          <w:rFonts w:ascii="Times New Roman" w:hAnsi="Times New Roman"/>
-        </w:rPr>
-        <w:t xml:space="preserve">Abstract </w:t>
-      </w:r>
-    </w:p>
-    <w:p>
-      <w:pPr>
-        <w:pStyle w:val="Heading1"/>
-        <w:rPr/>
-      </w:pPr>
-      <w:bookmarkStart w:id="0" w:name="heading-1"/>
+        <w:rPr/>
+        <w:t xml:space="preserve">Heading 1 </w:t>
+      </w:r>
+      <w:bookmarkEnd w:id="0"/>
+    </w:p>
+    <w:p>
+      <w:pPr>
+        <w:pStyle w:val="Heading2"/>
+        <w:rPr/>
+      </w:pPr>
+      <w:bookmarkStart w:id="1" w:name="heading-2"/>
       <w:r>
         <w:rPr/>
         <w:t xml:space="preserve"> </w:t>
       </w:r>
       <w:r>
         <w:rPr/>
-        <w:t xml:space="preserve">Heading 1 </w:t>
-      </w:r>
-      <w:bookmarkEnd w:id="0"/>
-    </w:p>
-    <w:p>
-      <w:pPr>
-        <w:pStyle w:val="Heading2"/>
-        <w:rPr/>
-      </w:pPr>
-      <w:bookmarkStart w:id="1" w:name="heading-2"/>
-      <w:r>
-        <w:rPr/>
+        <w:t xml:space="preserve">Heading 2 </w:t>
+      </w:r>
+      <w:bookmarkEnd w:id="1"/>
+    </w:p>
+    <w:p>
+      <w:pPr>
+        <w:pStyle w:val="Heading3"/>
+        <w:rPr>
+          <w:rFonts w:ascii="Times New Roman" w:hAnsi="Times New Roman"/>
+          <w:color w:val="000000"/>
+        </w:rPr>
+      </w:pPr>
+      <w:bookmarkStart w:id="2" w:name="heading-3"/>
+      <w:r>
+        <w:rPr>
+          <w:rFonts w:ascii="Times New Roman" w:hAnsi="Times New Roman"/>
+          <w:color w:val="000000"/>
+        </w:rPr>
         <w:t xml:space="preserve"> </w:t>
       </w:r>
       <w:r>
-        <w:rPr/>
-        <w:t xml:space="preserve">Heading 2 </w:t>
-      </w:r>
-      <w:bookmarkEnd w:id="1"/>
-    </w:p>
-    <w:p>
-      <w:pPr>
-        <w:pStyle w:val="Heading3"/>
-        <w:rPr>
-          <w:rFonts w:ascii="Times New Roman" w:hAnsi="Times New Roman"/>
-          <w:color w:val="000000"/>
-        </w:rPr>
-      </w:pPr>
-      <w:bookmarkStart w:id="2" w:name="heading-3"/>
+        <w:rPr>
+          <w:rFonts w:ascii="Times New Roman" w:hAnsi="Times New Roman"/>
+          <w:color w:val="000000"/>
+        </w:rPr>
+        <w:t xml:space="preserve">Heading 3 </w:t>
+      </w:r>
+      <w:bookmarkEnd w:id="2"/>
+    </w:p>
+    <w:p>
+      <w:pPr>
+        <w:pStyle w:val="Heading4"/>
+        <w:rPr>
+          <w:rFonts w:ascii="Times New Roman" w:hAnsi="Times New Roman"/>
+          <w:color w:val="000000"/>
+        </w:rPr>
+      </w:pPr>
+      <w:bookmarkStart w:id="3" w:name="heading-4"/>
       <w:r>
         <w:rPr>
           <w:rFonts w:ascii="Times New Roman" w:hAnsi="Times New Roman"/>
@@ -157,19 +176,19 @@
           <w:rFonts w:ascii="Times New Roman" w:hAnsi="Times New Roman"/>
           <w:color w:val="000000"/>
         </w:rPr>
-        <w:t xml:space="preserve">Heading 3 </w:t>
-      </w:r>
-      <w:bookmarkEnd w:id="2"/>
-    </w:p>
-    <w:p>
-      <w:pPr>
-        <w:pStyle w:val="Heading4"/>
-        <w:rPr>
-          <w:rFonts w:ascii="Times New Roman" w:hAnsi="Times New Roman"/>
-          <w:color w:val="000000"/>
-        </w:rPr>
-      </w:pPr>
-      <w:bookmarkStart w:id="3" w:name="heading-4"/>
+        <w:t xml:space="preserve">Heading 4 </w:t>
+      </w:r>
+      <w:bookmarkEnd w:id="3"/>
+    </w:p>
+    <w:p>
+      <w:pPr>
+        <w:pStyle w:val="Heading5"/>
+        <w:rPr>
+          <w:rFonts w:ascii="Times New Roman" w:hAnsi="Times New Roman"/>
+          <w:color w:val="000000"/>
+        </w:rPr>
+      </w:pPr>
+      <w:bookmarkStart w:id="4" w:name="heading-5"/>
       <w:r>
         <w:rPr>
           <w:rFonts w:ascii="Times New Roman" w:hAnsi="Times New Roman"/>
@@ -182,19 +201,19 @@
           <w:rFonts w:ascii="Times New Roman" w:hAnsi="Times New Roman"/>
           <w:color w:val="000000"/>
         </w:rPr>
-        <w:t xml:space="preserve">Heading 4 </w:t>
-      </w:r>
-      <w:bookmarkEnd w:id="3"/>
-    </w:p>
-    <w:p>
-      <w:pPr>
-        <w:pStyle w:val="Heading5"/>
-        <w:rPr>
-          <w:rFonts w:ascii="Times New Roman" w:hAnsi="Times New Roman"/>
-          <w:color w:val="000000"/>
-        </w:rPr>
-      </w:pPr>
-      <w:bookmarkStart w:id="4" w:name="heading-5"/>
+        <w:t xml:space="preserve">Heading 5 </w:t>
+      </w:r>
+      <w:bookmarkEnd w:id="4"/>
+    </w:p>
+    <w:p>
+      <w:pPr>
+        <w:pStyle w:val="Heading6"/>
+        <w:rPr>
+          <w:rFonts w:ascii="Times New Roman" w:hAnsi="Times New Roman"/>
+          <w:color w:val="000000"/>
+        </w:rPr>
+      </w:pPr>
+      <w:bookmarkStart w:id="5" w:name="heading-6"/>
       <w:r>
         <w:rPr>
           <w:rFonts w:ascii="Times New Roman" w:hAnsi="Times New Roman"/>
@@ -207,19 +226,19 @@
           <w:rFonts w:ascii="Times New Roman" w:hAnsi="Times New Roman"/>
           <w:color w:val="000000"/>
         </w:rPr>
-        <w:t xml:space="preserve">Heading 5 </w:t>
-      </w:r>
-      <w:bookmarkEnd w:id="4"/>
-    </w:p>
-    <w:p>
-      <w:pPr>
-        <w:pStyle w:val="Heading6"/>
-        <w:rPr>
-          <w:rFonts w:ascii="Times New Roman" w:hAnsi="Times New Roman"/>
-          <w:color w:val="000000"/>
-        </w:rPr>
-      </w:pPr>
-      <w:bookmarkStart w:id="5" w:name="heading-6"/>
+        <w:t xml:space="preserve">Heading 6 </w:t>
+      </w:r>
+      <w:bookmarkEnd w:id="5"/>
+    </w:p>
+    <w:p>
+      <w:pPr>
+        <w:pStyle w:val="Heading7"/>
+        <w:rPr>
+          <w:rFonts w:ascii="Times New Roman" w:hAnsi="Times New Roman"/>
+          <w:color w:val="000000"/>
+        </w:rPr>
+      </w:pPr>
+      <w:bookmarkStart w:id="6" w:name="heading-7"/>
       <w:r>
         <w:rPr>
           <w:rFonts w:ascii="Times New Roman" w:hAnsi="Times New Roman"/>
@@ -232,19 +251,19 @@
           <w:rFonts w:ascii="Times New Roman" w:hAnsi="Times New Roman"/>
           <w:color w:val="000000"/>
         </w:rPr>
-        <w:t xml:space="preserve">Heading 6 </w:t>
-      </w:r>
-      <w:bookmarkEnd w:id="5"/>
-    </w:p>
-    <w:p>
-      <w:pPr>
-        <w:pStyle w:val="Heading7"/>
-        <w:rPr>
-          <w:rFonts w:ascii="Times New Roman" w:hAnsi="Times New Roman"/>
-          <w:color w:val="000000"/>
-        </w:rPr>
-      </w:pPr>
-      <w:bookmarkStart w:id="6" w:name="heading-7"/>
+        <w:t xml:space="preserve">Heading 7 </w:t>
+      </w:r>
+      <w:bookmarkEnd w:id="6"/>
+    </w:p>
+    <w:p>
+      <w:pPr>
+        <w:pStyle w:val="Heading8"/>
+        <w:rPr>
+          <w:rFonts w:ascii="Times New Roman" w:hAnsi="Times New Roman"/>
+          <w:color w:val="000000"/>
+        </w:rPr>
+      </w:pPr>
+      <w:bookmarkStart w:id="7" w:name="heading-8"/>
       <w:r>
         <w:rPr>
           <w:rFonts w:ascii="Times New Roman" w:hAnsi="Times New Roman"/>
@@ -257,19 +276,19 @@
           <w:rFonts w:ascii="Times New Roman" w:hAnsi="Times New Roman"/>
           <w:color w:val="000000"/>
         </w:rPr>
-        <w:t xml:space="preserve">Heading 7 </w:t>
-      </w:r>
-      <w:bookmarkEnd w:id="6"/>
-    </w:p>
-    <w:p>
-      <w:pPr>
-        <w:pStyle w:val="Heading8"/>
-        <w:rPr>
-          <w:rFonts w:ascii="Times New Roman" w:hAnsi="Times New Roman"/>
-          <w:color w:val="000000"/>
-        </w:rPr>
-      </w:pPr>
-      <w:bookmarkStart w:id="7" w:name="heading-8"/>
+        <w:t xml:space="preserve">Heading 8 </w:t>
+      </w:r>
+      <w:bookmarkEnd w:id="7"/>
+    </w:p>
+    <w:p>
+      <w:pPr>
+        <w:pStyle w:val="Heading9"/>
+        <w:rPr>
+          <w:rFonts w:ascii="Times New Roman" w:hAnsi="Times New Roman"/>
+          <w:color w:val="000000"/>
+        </w:rPr>
+      </w:pPr>
+      <w:bookmarkStart w:id="8" w:name="heading-9"/>
       <w:r>
         <w:rPr>
           <w:rFonts w:ascii="Times New Roman" w:hAnsi="Times New Roman"/>
@@ -282,31 +301,6 @@
           <w:rFonts w:ascii="Times New Roman" w:hAnsi="Times New Roman"/>
           <w:color w:val="000000"/>
         </w:rPr>
-        <w:t xml:space="preserve">Heading 8 </w:t>
-      </w:r>
-      <w:bookmarkEnd w:id="7"/>
-    </w:p>
-    <w:p>
-      <w:pPr>
-        <w:pStyle w:val="Heading9"/>
-        <w:rPr>
-          <w:rFonts w:ascii="Times New Roman" w:hAnsi="Times New Roman"/>
-          <w:color w:val="000000"/>
-        </w:rPr>
-      </w:pPr>
-      <w:bookmarkStart w:id="8" w:name="heading-9"/>
-      <w:r>
-        <w:rPr>
-          <w:rFonts w:ascii="Times New Roman" w:hAnsi="Times New Roman"/>
-          <w:color w:val="000000"/>
-        </w:rPr>
-        <w:t xml:space="preserve"> </w:t>
-      </w:r>
-      <w:r>
-        <w:rPr>
-          <w:rFonts w:ascii="Times New Roman" w:hAnsi="Times New Roman"/>
-          <w:color w:val="000000"/>
-        </w:rPr>
         <w:t xml:space="preserve">Heading 9 </w:t>
       </w:r>
       <w:bookmarkEnd w:id="8"/>
@@ -320,10 +314,6 @@
       </w:pPr>
       <w:r>
         <w:rPr/>
-        <w:t xml:space="preserve"> </w:t>
-      </w:r>
-      <w:r>
-        <w:rPr/>
         <w:t>First Paragraph.</w:t>
       </w:r>
     </w:p>
@@ -344,57 +334,64 @@
       </w:pPr>
       <w:r>
         <w:rPr/>
-        <w:t>Right</w:t>
-      </w:r>
-    </w:p>
-    <w:p>
-      <w:pPr>
-        <w:pStyle w:val="Justified"/>
-        <w:rPr/>
-      </w:pPr>
-      <w:r>
-        <w:rPr/>
-        <w:t>Justified</w:t>
+        <w:t>Right Justified</w:t>
       </w:r>
     </w:p>
     <w:p>
       <w:pPr>
         <w:pStyle w:val="TextBody"/>
-        <w:rPr/>
-      </w:pPr>
-      <w:r>
-        <w:rPr/>
-        <w:t xml:space="preserve"> </w:t>
-      </w:r>
-      <w:r>
-        <w:rPr/>
+        <w:widowControl/>
+        <w:suppressAutoHyphens w:val="true"/>
+        <w:bidi w:val="0"/>
+        <w:spacing w:lineRule="auto" w:line="480" w:before="0" w:after="0"/>
+        <w:ind w:left="0" w:right="0" w:firstLine="720"/>
+        <w:jc w:val="left"/>
+        <w:rPr/>
+      </w:pPr>
+      <w:r>
+        <w:rPr>
+          <w:strike w:val="false"/>
+          <w:dstrike w:val="false"/>
+        </w:rPr>
         <w:t xml:space="preserve">Body Text. Body Text Char.    </w:t>
       </w:r>
       <w:r>
         <w:rPr>
           <w:rStyle w:val="VerbatimChar"/>
+          <w:strike w:val="false"/>
+          <w:dstrike w:val="false"/>
         </w:rPr>
         <w:t xml:space="preserve"> Verbatim Char </w:t>
       </w:r>
       <w:r>
-        <w:rPr/>
+        <w:rPr>
+          <w:strike w:val="false"/>
+          <w:dstrike w:val="false"/>
+        </w:rPr>
         <w:t xml:space="preserve"> .    </w:t>
       </w:r>
       <w:hyperlink r:id="rId2">
         <w:r>
           <w:rPr>
             <w:rStyle w:val="InternetLink"/>
+            <w:strike w:val="false"/>
+            <w:dstrike w:val="false"/>
           </w:rPr>
           <w:t xml:space="preserve"> Hyperlink </w:t>
         </w:r>
       </w:hyperlink>
       <w:r>
-        <w:rPr/>
+        <w:rPr>
+          <w:strike w:val="false"/>
+          <w:dstrike w:val="false"/>
+        </w:rPr>
         <w:t xml:space="preserve"> .     Footnote. </w:t>
       </w:r>
       <w:r>
         <w:rPr>
           <w:rStyle w:val="FootnoteAnchor"/>
+          <w:strike w:val="false"/>
+          <w:dstrike w:val="false"/>
         </w:rPr>
         <w:footnoteReference w:id="2"/>
       </w:r>
@@ -402,14 +399,16 @@
     <w:p>
       <w:pPr>
         <w:pStyle w:val="BlockText"/>
-        <w:rPr>
-          <w:rFonts w:ascii="Times New Roman" w:hAnsi="Times New Roman"/>
-        </w:rPr>
-      </w:pPr>
-      <w:r>
-        <w:rPr/>
-        <w:t xml:space="preserve"> </w:t>
-      </w:r>
+        <w:widowControl/>
+        <w:suppressAutoHyphens w:val="true"/>
+        <w:bidi w:val="0"/>
+        <w:spacing w:lineRule="auto" w:line="480" w:before="100" w:after="100"/>
+        <w:ind w:left="0" w:right="449" w:firstLine="720"/>
+        <w:jc w:val="left"/>
+        <w:rPr>
+          <w:rFonts w:ascii="Times New Roman" w:hAnsi="Times New Roman"/>
+        </w:rPr>
+      </w:pPr>
       <w:r>
         <w:rPr/>
         <w:t xml:space="preserve">Block Text. </w:t>
@@ -422,12 +421,6 @@
           <w:rFonts w:ascii="Times New Roman" w:hAnsi="Times New Roman"/>
         </w:rPr>
       </w:pPr>
-      <w:r>
-        <w:rPr>
-          <w:rFonts w:ascii="Times New Roman" w:hAnsi="Times New Roman"/>
-        </w:rPr>
-        <w:t xml:space="preserve"> </w:t>
-      </w:r>
       <w:r>
         <w:rPr>
           <w:rFonts w:ascii="Times New Roman" w:hAnsi="Times New Roman"/>
@@ -648,12 +641,6 @@
         <w:rPr>
           <w:rFonts w:ascii="Times New Roman" w:hAnsi="Times New Roman"/>
         </w:rPr>
-        <w:t xml:space="preserve"> </w:t>
-      </w:r>
-      <w:r>
-        <w:rPr>
-          <w:rFonts w:ascii="Times New Roman" w:hAnsi="Times New Roman"/>
-        </w:rPr>
         <w:t xml:space="preserve">Image Caption </w:t>
       </w:r>
     </w:p>
@@ -668,12 +655,6 @@
         <w:rPr>
           <w:rFonts w:ascii="Times New Roman" w:hAnsi="Times New Roman"/>
         </w:rPr>
-        <w:t xml:space="preserve"> </w:t>
-      </w:r>
-      <w:r>
-        <w:rPr>
-          <w:rFonts w:ascii="Times New Roman" w:hAnsi="Times New Roman"/>
-        </w:rPr>
         <w:t xml:space="preserve">DefinitionTerm </w:t>
       </w:r>
     </w:p>
@@ -688,12 +669,6 @@
         <w:rPr>
           <w:rFonts w:ascii="Times New Roman" w:hAnsi="Times New Roman"/>
         </w:rPr>
-        <w:t xml:space="preserve"> </w:t>
-      </w:r>
-      <w:r>
-        <w:rPr>
-          <w:rFonts w:ascii="Times New Roman" w:hAnsi="Times New Roman"/>
-        </w:rPr>
         <w:t xml:space="preserve">Definition </w:t>
       </w:r>
     </w:p>
@@ -705,37 +680,7 @@
         </w:rPr>
       </w:pPr>
       <w:r>
-        <w:rPr>
-          <w:rFonts w:ascii="Times New Roman" w:hAnsi="Times New Roman"/>
-        </w:rPr>
-        <w:t xml:space="preserve"> </w:t>
-      </w:r>
-      <w:r>
-        <w:rPr>
-          <w:rFonts w:ascii="Times New Roman" w:hAnsi="Times New Roman"/>
-        </w:rPr>
-        <w:t xml:space="preserve">DefinitionTerm </w:t>
-      </w:r>
-    </w:p>
-    <w:p>
-      <w:pPr>
-        <w:pStyle w:val="Definition"/>
-        <w:spacing w:before="0" w:after="200"/>
-        <w:rPr>
-          <w:rFonts w:ascii="Times New Roman" w:hAnsi="Times New Roman"/>
-        </w:rPr>
-      </w:pPr>
-      <w:r>
-        <w:rPr>
-          <w:rFonts w:ascii="Times New Roman" w:hAnsi="Times New Roman"/>
-        </w:rPr>
-        <w:t xml:space="preserve"> </w:t>
-      </w:r>
-      <w:r>
-        <w:rPr>
-          <w:rFonts w:ascii="Times New Roman" w:hAnsi="Times New Roman"/>
-        </w:rPr>
-        <w:t xml:space="preserve">Definition </w:t>
+        <w:rPr/>
       </w:r>
     </w:p>
     <w:sectPr>
@@ -853,7 +798,6 @@
       <w:keepNext w:val="true"/>
       <w:keepLines/>
       <w:pageBreakBefore/>
-      <w:pBdr/>
       <w:spacing w:lineRule="auto" w:line="480" w:before="0" w:after="144"/>
       <w:jc w:val="center"/>
       <w:outlineLvl w:val="0"/>

</xml_diff>